<commit_message>
Deploying to gh-pages from @ d-morrison/rme@8f5f48bab22f0353356eaeb7f27013625b6dff94 🚀
</commit_message>
<xml_diff>
--- a/chapters/Intro-to-GLMs-handout.docx
+++ b/chapters/Intro-to-GLMs-handout.docx
@@ -2291,13 +2291,6 @@
         </w:tc>
       </w:tr>
     </w:tbl>
-    <w:p>
-      <w:r>
-        <w:pict>
-          <v:rect style="width:0;height:1.5pt" o:hralign="center" o:hrstd="t" o:hr="t"/>
-        </w:pict>
-      </w:r>
-    </w:p>
     <w:tbl>
       <w:tblPr>
         <w:tblStyle w:val="Table"/>
@@ -2328,7 +2321,7 @@
           </w:tcPr>
           <w:p>
             <w:pPr>
-              <w:pStyle w:val="FirstParagraph"/>
+              <w:pStyle w:val="BodyText"/>
             </w:pPr>
             <w:pPr>
               <w:spacing w:before="16" w:after="16"/>
@@ -9729,13 +9722,6 @@
         </w:tc>
       </w:tr>
     </w:tbl>
-    <w:p>
-      <w:r>
-        <w:pict>
-          <v:rect style="width:0;height:1.5pt" o:hralign="center" o:hrstd="t" o:hr="t"/>
-        </w:pict>
-      </w:r>
-    </w:p>
     <w:tbl>
       <w:tblPr>
         <w:tblStyle w:val="Table"/>
@@ -9764,7 +9750,7 @@
           </w:tcPr>
           <w:p>
             <w:pPr>
-              <w:pStyle w:val="FirstParagraph"/>
+              <w:pStyle w:val="BodyText"/>
             </w:pPr>
             <w:pPr>
               <w:spacing w:before="16" w:after="64"/>
@@ -9793,13 +9779,6 @@
         </w:tc>
       </w:tr>
     </w:tbl>
-    <w:p>
-      <w:r>
-        <w:pict>
-          <v:rect style="width:0;height:1.5pt" o:hralign="center" o:hrstd="t" o:hr="t"/>
-        </w:pict>
-      </w:r>
-    </w:p>
     <w:tbl>
       <w:tblPr>
         <w:tblStyle w:val="Table"/>
@@ -9830,7 +9809,7 @@
           </w:tcPr>
           <w:p>
             <w:pPr>
-              <w:pStyle w:val="FirstParagraph"/>
+              <w:pStyle w:val="BodyText"/>
             </w:pPr>
             <w:pPr>
               <w:spacing w:before="16" w:after="16"/>

</xml_diff>